<commit_message>
Align Roles and Systems wording between Payment Services and Fraud rows
Payment Services Team row now mirrors the Fraud Prevention Team row's
structure, explicitly naming the ATM/POS trace as the referral source for
non-fraud disputes, per client-confirmed CRM routing (ATM/POS trace ->
Payment Services; Fraud Intake -> Risk/Fraud team).

Co-Authored-By: Claude Sonnet 5 <noreply@anthropic.com>
Claude-Session: https://claude.ai/code/session_01Msiz5p6hoKmmUHZyLJTkqb
</commit_message>
<xml_diff>
--- a/Dispute Resolution/DRAFT - Visa Debit Dispute Management Procedure.docx
+++ b/Dispute Resolution/DRAFT - Visa Debit Dispute Management Procedure.docx
@@ -2883,7 +2883,7 @@
               <w:rPr>
                 <w:b w:val="0"/>
               </w:rPr>
-              <w:t>Investigates and manages non-fraud (recognized/authorized) disputes, prepares case documentation, submits eligible disputes to Central 1, monitors Acquirer responses and escalations, and manages dispute outcomes and recoveries for non-fraud cases. Refers to the Visa Debit Card Non-Fraud Investigation Process for detailed investigation steps.</w:t>
+              <w:t>Investigates and manages non-fraud (recognized/authorized transactions) disputes referred via the ATM / POS trace, prepares case documentation, submits eligible disputes to Central 1, monitors Acquirer responses and escalations, and manages dispute outcomes and recoveries for non-fraud cases. Refers to the Visa Debit Card Non-Fraud Investigation Process for detailed investigation steps.</w:t>
             </w:r>
           </w:p>
         </w:tc>
@@ -2913,7 +2913,7 @@
               <w:rPr>
                 <w:b w:val="0"/>
               </w:rPr>
-              <w:t>Investigates and manages fraud (unrecognized/unauthorized) disputes referred via the Fraud Intake Form (FIF), prepares case documentation, submits eligible disputes to Central 1, monitors Acquirer responses and escalations, and manages dispute outcomes and recoveries for fraud cases. Refers to the Visa Debit Card Fraud Investigation Process for detailed investigation steps.</w:t>
+              <w:t>Investigates and manages fraud (unrecognized/unauthorized transactions) disputes referred via the Fraud Intake Form (FIF), prepares case documentation, submits eligible disputes to Central 1, monitors Acquirer responses and escalations, and manages dispute outcomes and recoveries for fraud cases. Refers to the Visa Debit Card Fraud Investigation Process for detailed investigation steps.</w:t>
             </w:r>
           </w:p>
         </w:tc>

</xml_diff>

<commit_message>
Restructure Stage 1 intake procedure per reviewer feedback
- Trim 4.2.1 to receive + authenticate only; move the previously
  front-loaded steps (dispute detail capture, card block, case creation)
  into the sequential Non-Fraud/Fraud subsections where they actually
  occur.
- 4.2.3 (Non-Fraud): case creation now folded into the trace-form/hand-off
  step, since trace submission is what creates the case.
- 4.2.4 (Fraud): card block/reissue to "HOT" status now happens first,
  upon fraud determination, ahead of the credential-security questions;
  case creation folded into the FIF completion/hand-off step.
- Flag the member-authentication reference and the card-block system as
  open items (TBC-01, TBC-02) in Appendix C rather than guessing.
- Capitalize "Branch" consistently with "Contact Centre" throughout,
  matching the source template's convention.

Co-Authored-By: Claude Sonnet 5 <noreply@anthropic.com>
Claude-Session: https://claude.ai/code/session_01Msiz5p6hoKmmUHZyLJTkqb
</commit_message>
<xml_diff>
--- a/Dispute Resolution/DRAFT - Visa Debit Dispute Management Procedure.docx
+++ b/Dispute Resolution/DRAFT - Visa Debit Dispute Management Procedure.docx
@@ -2755,7 +2755,7 @@
         <w:t xml:space="preserve">Member-Reported Dispute: </w:t>
       </w:r>
       <w:r>
-        <w:t>occurs when a member contacts the Contact Centre or a branch to dispute a Visa Debit Card transaction.</w:t>
+        <w:t>occurs when a member contacts the Contact Centre or a Branch to dispute a Visa Debit Card transaction.</w:t>
       </w:r>
     </w:p>
     <w:p>
@@ -2853,7 +2853,7 @@
               <w:rPr>
                 <w:b w:val="0"/>
               </w:rPr>
-              <w:t>Front-line Contact Centre and branch staff who receive the member's dispute claim, verify the cardholder and impacted transaction(s), administer the Visa Debit Dispute Questions to determine transaction recognition and authorization, perform initial account security actions (block/reissue) where required, and create and assign the case.</w:t>
+              <w:t>Front-line Contact Centre and Branch staff who receive the member's dispute claim, verify the cardholder and impacted transaction(s), administer the Visa Debit Dispute Questions to determine transaction recognition and authorization, perform initial account security actions (block/reissue) where required, and create and assign the case.</w:t>
             </w:r>
           </w:p>
         </w:tc>
@@ -3182,7 +3182,7 @@
     </w:p>
     <w:p>
       <w:r>
-        <w:t>The visual overview below provides the end-to-end process for a member contacting the Contact Centre or a branch to initiate a Visa Debit Card dispute. This stage is owned by Growth.</w:t>
+        <w:t>The visual overview below provides the end-to-end process for a member contacting the Contact Centre or a Branch to initiate a Visa Debit Card dispute. This stage is owned by Growth.</w:t>
       </w:r>
     </w:p>
     <w:p>
@@ -3255,12 +3255,12 @@
         <w:rPr>
           <w:sz w:val="28"/>
         </w:rPr>
-        <w:t>4.2.1 Receive, Verify, and Record the Claim</w:t>
-      </w:r>
-    </w:p>
-    <w:p>
-      <w:r>
-        <w:t>Upon a member contacting the Contact Centre or a branch to dispute a Visa Debit Card transaction, the Growth Team member should:</w:t>
+        <w:t>4.2.1 Receive and Verify the Member</w:t>
+      </w:r>
+    </w:p>
+    <w:p>
+      <w:r>
+        <w:t>Upon a member contacting the Contact Centre or a Branch to dispute a Visa Debit Card transaction, the Growth Team member should:</w:t>
       </w:r>
     </w:p>
     <w:p>
@@ -3272,7 +3272,7 @@
         </w:numPr>
       </w:pPr>
       <w:r>
-        <w:t>Receive the member's dispute claim via the Contact Centre or branch.</w:t>
+        <w:t>Receive the member's dispute claim via the Contact Centre or Branch.</w:t>
       </w:r>
     </w:p>
     <w:p>
@@ -3284,43 +3284,25 @@
         </w:numPr>
       </w:pPr>
       <w:r>
-        <w:t>Verify the cardholder's identity and confirm the member is authenticated. If the member cannot be authenticated, do not proceed with intake.</w:t>
-      </w:r>
-    </w:p>
-    <w:p>
-      <w:pPr>
-        <w:pStyle w:val="ListParagraph"/>
-        <w:numPr>
-          <w:ilvl w:val="0"/>
-          <w:numId w:val="1000"/>
-        </w:numPr>
-      </w:pPr>
-      <w:r>
-        <w:t>Record the reason for the dispute (fraud or non-fraud), transaction date(s), amount(s), merchant information, and other relevant details.</w:t>
-      </w:r>
-    </w:p>
-    <w:p>
-      <w:pPr>
-        <w:pStyle w:val="ListParagraph"/>
-        <w:numPr>
-          <w:ilvl w:val="0"/>
-          <w:numId w:val="1000"/>
-        </w:numPr>
-      </w:pPr>
-      <w:r>
-        <w:t>Block or reissue the Visa Debit Card if account security is at risk.</w:t>
-      </w:r>
-    </w:p>
-    <w:p>
-      <w:pPr>
-        <w:pStyle w:val="ListParagraph"/>
-        <w:numPr>
-          <w:ilvl w:val="0"/>
-          <w:numId w:val="1000"/>
-        </w:numPr>
-      </w:pPr>
-      <w:r>
-        <w:t>Create a case, add any required notices, and assign case ownership.</w:t>
+        <w:rPr>
+          <w:b w:val="0"/>
+          <w:i w:val="0"/>
+        </w:rPr>
+        <w:t xml:space="preserve">Verify the cardholder's identity and confirm the member is authenticated, </w:t>
+      </w:r>
+      <w:r>
+        <w:rPr>
+          <w:b w:val="0"/>
+          <w:i/>
+        </w:rPr>
+        <w:t>per Beem's existing member authentication procedures [TBC — reference to be confirmed]</w:t>
+      </w:r>
+      <w:r>
+        <w:rPr>
+          <w:b w:val="0"/>
+          <w:i w:val="0"/>
+        </w:rPr>
+        <w:t>. If the member cannot be authenticated, do not proceed with intake.</w:t>
       </w:r>
     </w:p>
     <w:p>
@@ -3522,7 +3504,7 @@
     </w:p>
     <w:p>
       <w:r>
-        <w:t>The Growth Team member should then fill out the existing POS/ATM trace form, record the member's narrative, and hand off the case to the Payment Services team. See the Current Process — How to Initiate an ATM &amp; POS Trace for the detailed trace form completion steps.</w:t>
+        <w:t>The Growth Team member should then fill out the existing POS/ATM trace form, record the member's narrative, create the case, add any required notices, and hand off the case to the Payment Services team. See the Current Process — How to Initiate an ATM &amp; POS Trace for the detailed trace form completion steps.</w:t>
       </w:r>
     </w:p>
     <w:p>
@@ -3538,12 +3520,12 @@
         <w:rPr>
           <w:sz w:val="28"/>
         </w:rPr>
-        <w:t>4.2.4 If Unrecognized or Unauthorized (Fraud) — Confirm Card and Credential Security</w:t>
-      </w:r>
-    </w:p>
-    <w:p>
-      <w:r>
-        <w:t>If the member does not recognize or did not authorize the transaction, the Growth Team member should also ask:</w:t>
+        <w:t>4.2.4 If Unrecognized or Unauthorized (Fraud) — Secure the Account and Confirm Card and Credential Security</w:t>
+      </w:r>
+    </w:p>
+    <w:p>
+      <w:r>
+        <w:t>Once the transaction is determined to be unrecognized or unauthorized, the Growth Team member should first secure the member's account:</w:t>
       </w:r>
     </w:p>
     <w:p>
@@ -3556,6 +3538,41 @@
       </w:pPr>
       <w:r>
         <w:rPr>
+          <w:b w:val="0"/>
+          <w:i w:val="0"/>
+        </w:rPr>
+        <w:t xml:space="preserve">Block or reissue the Visa Debit Card </w:t>
+      </w:r>
+      <w:r>
+        <w:rPr>
+          <w:b w:val="0"/>
+          <w:i/>
+        </w:rPr>
+        <w:t>[TBC — system to be confirmed, e.g., DNA]</w:t>
+      </w:r>
+      <w:r>
+        <w:rPr>
+          <w:b w:val="0"/>
+          <w:i w:val="0"/>
+        </w:rPr>
+        <w:t xml:space="preserve"> and set the card status to “HOT”.</w:t>
+      </w:r>
+    </w:p>
+    <w:p>
+      <w:r>
+        <w:t>The Growth Team member should then ask:</w:t>
+      </w:r>
+    </w:p>
+    <w:p>
+      <w:pPr>
+        <w:pStyle w:val="ListParagraph"/>
+        <w:numPr>
+          <w:ilvl w:val="0"/>
+          <w:numId w:val="1004"/>
+        </w:numPr>
+      </w:pPr>
+      <w:r>
+        <w:rPr>
           <w:b/>
           <w:i w:val="0"/>
         </w:rPr>
@@ -3570,7 +3587,7 @@
         <w:pStyle w:val="ListParagraph"/>
         <w:numPr>
           <w:ilvl w:val="0"/>
-          <w:numId w:val="1003"/>
+          <w:numId w:val="1004"/>
         </w:numPr>
       </w:pPr>
       <w:r>
@@ -3589,7 +3606,7 @@
         <w:pStyle w:val="ListParagraph"/>
         <w:numPr>
           <w:ilvl w:val="0"/>
-          <w:numId w:val="1003"/>
+          <w:numId w:val="1004"/>
         </w:numPr>
       </w:pPr>
       <w:r>
@@ -3605,7 +3622,7 @@
     </w:p>
     <w:p>
       <w:r>
-        <w:t>The Growth Team member should then follow existing fraud procedures (e.g., Account Takeover, scams, etc.), including completing the Fraud Intake Form (FIF) — see the Fraud Intake Form Procedures — and hand off the case to the Fraud Prevention team.</w:t>
+        <w:t>The Growth Team member should then follow existing fraud procedures (e.g., Account Takeover, scams, etc.), including completing the Fraud Intake Form (FIF) — see the Fraud Intake Form Procedures — which creates the case and hands it off to the Fraud Prevention team.</w:t>
       </w:r>
     </w:p>
     <w:p>
@@ -3738,7 +3755,7 @@
         <w:pStyle w:val="ListParagraph"/>
         <w:numPr>
           <w:ilvl w:val="0"/>
-          <w:numId w:val="1004"/>
+          <w:numId w:val="1005"/>
         </w:numPr>
       </w:pPr>
       <w:r>
@@ -3750,7 +3767,7 @@
         <w:pStyle w:val="ListParagraph"/>
         <w:numPr>
           <w:ilvl w:val="0"/>
-          <w:numId w:val="1004"/>
+          <w:numId w:val="1005"/>
         </w:numPr>
       </w:pPr>
       <w:r>
@@ -4290,7 +4307,7 @@
         <w:pStyle w:val="ListParagraph"/>
         <w:numPr>
           <w:ilvl w:val="0"/>
-          <w:numId w:val="1005"/>
+          <w:numId w:val="1006"/>
         </w:numPr>
       </w:pPr>
       <w:r>
@@ -4302,7 +4319,7 @@
         <w:pStyle w:val="ListParagraph"/>
         <w:numPr>
           <w:ilvl w:val="0"/>
-          <w:numId w:val="1005"/>
+          <w:numId w:val="1006"/>
         </w:numPr>
       </w:pPr>
       <w:r>
@@ -4314,7 +4331,7 @@
         <w:pStyle w:val="ListParagraph"/>
         <w:numPr>
           <w:ilvl w:val="0"/>
-          <w:numId w:val="1005"/>
+          <w:numId w:val="1006"/>
         </w:numPr>
       </w:pPr>
       <w:r>
@@ -4326,7 +4343,7 @@
         <w:pStyle w:val="ListParagraph"/>
         <w:numPr>
           <w:ilvl w:val="0"/>
-          <w:numId w:val="1005"/>
+          <w:numId w:val="1006"/>
         </w:numPr>
       </w:pPr>
       <w:r>
@@ -4458,7 +4475,7 @@
         <w:pStyle w:val="ListParagraph"/>
         <w:numPr>
           <w:ilvl w:val="0"/>
-          <w:numId w:val="1006"/>
+          <w:numId w:val="1007"/>
         </w:numPr>
       </w:pPr>
       <w:r>
@@ -4470,7 +4487,7 @@
         <w:pStyle w:val="ListParagraph"/>
         <w:numPr>
           <w:ilvl w:val="0"/>
-          <w:numId w:val="1006"/>
+          <w:numId w:val="1007"/>
         </w:numPr>
       </w:pPr>
       <w:r>
@@ -4601,7 +4618,7 @@
         <w:pStyle w:val="ListParagraph"/>
         <w:numPr>
           <w:ilvl w:val="0"/>
-          <w:numId w:val="1007"/>
+          <w:numId w:val="1008"/>
         </w:numPr>
       </w:pPr>
       <w:r>
@@ -4613,7 +4630,7 @@
         <w:pStyle w:val="ListParagraph"/>
         <w:numPr>
           <w:ilvl w:val="0"/>
-          <w:numId w:val="1007"/>
+          <w:numId w:val="1008"/>
         </w:numPr>
       </w:pPr>
       <w:r>
@@ -4625,7 +4642,7 @@
         <w:pStyle w:val="ListParagraph"/>
         <w:numPr>
           <w:ilvl w:val="0"/>
-          <w:numId w:val="1007"/>
+          <w:numId w:val="1008"/>
         </w:numPr>
       </w:pPr>
       <w:r>
@@ -4637,7 +4654,7 @@
         <w:pStyle w:val="ListParagraph"/>
         <w:numPr>
           <w:ilvl w:val="0"/>
-          <w:numId w:val="1007"/>
+          <w:numId w:val="1008"/>
         </w:numPr>
       </w:pPr>
       <w:r>
@@ -4826,7 +4843,7 @@
         <w:pStyle w:val="ListParagraph"/>
         <w:numPr>
           <w:ilvl w:val="0"/>
-          <w:numId w:val="1008"/>
+          <w:numId w:val="1009"/>
         </w:numPr>
       </w:pPr>
       <w:r>
@@ -4838,7 +4855,7 @@
         <w:pStyle w:val="ListParagraph"/>
         <w:numPr>
           <w:ilvl w:val="0"/>
-          <w:numId w:val="1008"/>
+          <w:numId w:val="1009"/>
         </w:numPr>
       </w:pPr>
       <w:r>
@@ -4871,7 +4888,7 @@
         <w:pStyle w:val="ListParagraph"/>
         <w:numPr>
           <w:ilvl w:val="0"/>
-          <w:numId w:val="1009"/>
+          <w:numId w:val="1010"/>
         </w:numPr>
       </w:pPr>
       <w:r>
@@ -4883,7 +4900,7 @@
         <w:pStyle w:val="ListParagraph"/>
         <w:numPr>
           <w:ilvl w:val="0"/>
-          <w:numId w:val="1009"/>
+          <w:numId w:val="1010"/>
         </w:numPr>
       </w:pPr>
       <w:r>
@@ -4916,7 +4933,7 @@
         <w:pStyle w:val="ListParagraph"/>
         <w:numPr>
           <w:ilvl w:val="0"/>
-          <w:numId w:val="1010"/>
+          <w:numId w:val="1011"/>
         </w:numPr>
       </w:pPr>
       <w:r>
@@ -4928,7 +4945,7 @@
         <w:pStyle w:val="ListParagraph"/>
         <w:numPr>
           <w:ilvl w:val="0"/>
-          <w:numId w:val="1010"/>
+          <w:numId w:val="1011"/>
         </w:numPr>
       </w:pPr>
       <w:r>
@@ -4961,7 +4978,7 @@
         <w:pStyle w:val="ListParagraph"/>
         <w:numPr>
           <w:ilvl w:val="0"/>
-          <w:numId w:val="1011"/>
+          <w:numId w:val="1012"/>
         </w:numPr>
       </w:pPr>
       <w:r>
@@ -4973,7 +4990,7 @@
         <w:pStyle w:val="ListParagraph"/>
         <w:numPr>
           <w:ilvl w:val="0"/>
-          <w:numId w:val="1011"/>
+          <w:numId w:val="1012"/>
         </w:numPr>
       </w:pPr>
       <w:r>
@@ -4985,7 +5002,7 @@
         <w:pStyle w:val="ListParagraph"/>
         <w:numPr>
           <w:ilvl w:val="0"/>
-          <w:numId w:val="1011"/>
+          <w:numId w:val="1012"/>
         </w:numPr>
       </w:pPr>
       <w:r>
@@ -5714,6 +5731,94 @@
                 <w:b w:val="0"/>
               </w:rPr>
               <w:t>The provisional credit will be issued in parallel with the investigation, to meet the 2 business day Visa SLA.</w:t>
+            </w:r>
+          </w:p>
+        </w:tc>
+      </w:tr>
+      <w:tr>
+        <w:tc>
+          <w:tcPr>
+            <w:tcW w:type="dxa" w:w="3120"/>
+          </w:tcPr>
+          <w:p>
+            <w:r/>
+            <w:r>
+              <w:rPr>
+                <w:b w:val="0"/>
+              </w:rPr>
+              <w:t>TBC-01</w:t>
+            </w:r>
+          </w:p>
+        </w:tc>
+        <w:tc>
+          <w:tcPr>
+            <w:tcW w:type="dxa" w:w="3120"/>
+          </w:tcPr>
+          <w:p>
+            <w:r/>
+            <w:r>
+              <w:rPr>
+                <w:b w:val="0"/>
+              </w:rPr>
+              <w:t>Open Item</w:t>
+            </w:r>
+          </w:p>
+        </w:tc>
+        <w:tc>
+          <w:tcPr>
+            <w:tcW w:type="dxa" w:w="3120"/>
+          </w:tcPr>
+          <w:p>
+            <w:r/>
+            <w:r>
+              <w:rPr>
+                <w:b w:val="0"/>
+              </w:rPr>
+              <w:t>Reference document for member authentication procedures (Stage 1, Section 4.2.1) to be confirmed.</w:t>
+            </w:r>
+          </w:p>
+        </w:tc>
+      </w:tr>
+      <w:tr>
+        <w:tc>
+          <w:tcPr>
+            <w:tcW w:type="dxa" w:w="3120"/>
+          </w:tcPr>
+          <w:p>
+            <w:r/>
+            <w:r>
+              <w:rPr>
+                <w:b w:val="0"/>
+              </w:rPr>
+              <w:t>TBC-02</w:t>
+            </w:r>
+          </w:p>
+        </w:tc>
+        <w:tc>
+          <w:tcPr>
+            <w:tcW w:type="dxa" w:w="3120"/>
+          </w:tcPr>
+          <w:p>
+            <w:r/>
+            <w:r>
+              <w:rPr>
+                <w:b w:val="0"/>
+              </w:rPr>
+              <w:t>Open Item</w:t>
+            </w:r>
+          </w:p>
+        </w:tc>
+        <w:tc>
+          <w:tcPr>
+            <w:tcW w:type="dxa" w:w="3120"/>
+          </w:tcPr>
+          <w:p>
+            <w:r/>
+            <w:r>
+              <w:rPr>
+                <w:b w:val="0"/>
+              </w:rPr>
+              <w:t>System used to block/reissue the Visa Debit Card and set it to “HOT” status (Stage 1, Section 4.2.4) to be confirmed — believed to be DNA.</w:t>
             </w:r>
           </w:p>
         </w:tc>
@@ -13680,6 +13785,9 @@
     <w:abstractNumId w:val="22"/>
   </w:num>
   <w:num w:numId="1011">
+    <w:abstractNumId w:val="22"/>
+  </w:num>
+  <w:num w:numId="1012">
     <w:abstractNumId w:val="22"/>
   </w:num>
   <w:numIdMacAtCleanup w:val="57"/>

</xml_diff>

<commit_message>
Reorder 4.2.2 questions and restructure 4.2.3 per reviewer feedback
- 4.2.2: reorder to Q1 transaction details, Q2 posted?, Q3
  authorized/recognized? -- details have to come first since that's how
  the agent identifies which transaction is even being discussed before
  posting/authorization can be checked.
- 4.2.3: separate each question from its resulting action, including the
  "contact the merchant first" requirement on Q1 and the forgotten-
  subscription resolution path on Q2.
- Replace the generic "fill out the trace form ... see the ATM & POS
  Trace doc" closing with the actual CRM Service Request step (the ATM &
  POS Trace doc is Payment Services' processing-side SOP, not Growth's
  intake step, per earlier discussion).

Co-Authored-By: Claude Sonnet 5 <noreply@anthropic.com>
Claude-Session: https://claude.ai/code/session_01Msiz5p6hoKmmUHZyLJTkqb
</commit_message>
<xml_diff>
--- a/Dispute Resolution/DRAFT - Visa Debit Dispute Management Procedure.docx
+++ b/Dispute Resolution/DRAFT - Visa Debit Dispute Management Procedure.docx
@@ -3323,7 +3323,7 @@
     </w:p>
     <w:p>
       <w:r>
-        <w:t>To confirm the transaction has posted and determine whether it is recognized/authorized (Non-Fraud) or unrecognized/unauthorized (Fraud), the Growth Team member should ask Questions 1-3 of the Visa Debit Dispute Questions below:</w:t>
+        <w:t>To identify the transaction, confirm it has posted, and determine whether it is recognized/authorized (Non-Fraud) or unrecognized/unauthorized (Fraud), the Growth Team member should ask Questions 1-3 of the Visa Debit Dispute Questions below:</w:t>
       </w:r>
     </w:p>
     <w:p>
@@ -3339,6 +3339,25 @@
           <w:b/>
           <w:i w:val="0"/>
         </w:rPr>
+        <w:t>Confirm transaction details</w:t>
+      </w:r>
+      <w:r>
+        <w:t xml:space="preserve"> — what are the date, amount, and merchant name of the disputed transaction?</w:t>
+      </w:r>
+    </w:p>
+    <w:p>
+      <w:pPr>
+        <w:pStyle w:val="ListParagraph"/>
+        <w:numPr>
+          <w:ilvl w:val="0"/>
+          <w:numId w:val="1001"/>
+        </w:numPr>
+      </w:pPr>
+      <w:r>
+        <w:rPr>
+          <w:b/>
+          <w:i w:val="0"/>
+        </w:rPr>
         <w:t>Confirm transaction posting</w:t>
       </w:r>
       <w:r>
@@ -3380,7 +3399,7 @@
         <w:t xml:space="preserve">If posted: </w:t>
       </w:r>
       <w:r>
-        <w:t>proceed to Question 2.</w:t>
+        <w:t>proceed to Question 3.</w:t>
       </w:r>
     </w:p>
     <w:p>
@@ -3418,7 +3437,7 @@
         <w:t xml:space="preserve">If the member authorized the transaction and/or recognizes the merchant: </w:t>
       </w:r>
       <w:r>
-        <w:t>this indicates a Non-Fraud dispute. Proceed to Question 3, then Section 4.2.3 — If Recognized (Non-Fraud).</w:t>
+        <w:t>this indicates a Non-Fraud dispute. Proceed to Section 4.2.3 — If Recognized (Non-Fraud).</w:t>
       </w:r>
     </w:p>
     <w:p>
@@ -3437,26 +3456,7 @@
         <w:t xml:space="preserve">If the member did not authorize the transaction and/or does not recognize the merchant: </w:t>
       </w:r>
       <w:r>
-        <w:t>this indicates a Fraud dispute. Proceed to Question 3, then Section 4.2.4 — If Unrecognized or Unauthorized (Fraud).</w:t>
-      </w:r>
-    </w:p>
-    <w:p>
-      <w:pPr>
-        <w:pStyle w:val="ListParagraph"/>
-        <w:numPr>
-          <w:ilvl w:val="0"/>
-          <w:numId w:val="1001"/>
-        </w:numPr>
-      </w:pPr>
-      <w:r>
-        <w:rPr>
-          <w:b/>
-          <w:i w:val="0"/>
-        </w:rPr>
-        <w:t>Confirm transaction details</w:t>
-      </w:r>
-      <w:r>
-        <w:t xml:space="preserve"> — what are the date, amount, and merchant name of the disputed transaction?</w:t>
+        <w:t>this indicates a Fraud dispute. Proceed to Section 4.2.4 — If Unrecognized or Unauthorized (Fraud).</w:t>
       </w:r>
     </w:p>
     <w:p>
@@ -3503,6 +3503,44 @@
       <w:pPr>
         <w:pStyle w:val="ListParagraph"/>
         <w:numPr>
+          <w:ilvl w:val="1"/>
+          <w:numId w:val="1002"/>
+        </w:numPr>
+      </w:pPr>
+      <w:r>
+        <w:rPr>
+          <w:b/>
+          <w:i w:val="0"/>
+        </w:rPr>
+        <w:t xml:space="preserve">If not yet contacted: </w:t>
+      </w:r>
+      <w:r>
+        <w:t>the member must first attempt to contact the merchant directly to resolve the issue before the dispute can proceed.</w:t>
+      </w:r>
+    </w:p>
+    <w:p>
+      <w:pPr>
+        <w:pStyle w:val="ListParagraph"/>
+        <w:numPr>
+          <w:ilvl w:val="1"/>
+          <w:numId w:val="1002"/>
+        </w:numPr>
+      </w:pPr>
+      <w:r>
+        <w:rPr>
+          <w:b/>
+          <w:i w:val="0"/>
+        </w:rPr>
+        <w:t xml:space="preserve">If already contacted: </w:t>
+      </w:r>
+      <w:r>
+        <w:t>record the merchant's response and proceed.</w:t>
+      </w:r>
+    </w:p>
+    <w:p>
+      <w:pPr>
+        <w:pStyle w:val="ListParagraph"/>
+        <w:numPr>
           <w:ilvl w:val="0"/>
           <w:numId w:val="1002"/>
         </w:numPr>
@@ -3515,7 +3553,45 @@
         <w:t>Confirm recurring/subscription billing</w:t>
       </w:r>
       <w:r>
-        <w:t xml:space="preserve"> — could this charge be part of a recurring subscription or membership?</w:t>
+        <w:t xml:space="preserve"> — could this charge be part of a recurring subscription or membership? This helps the member identify a recurring charge they may have forgotten about.</w:t>
+      </w:r>
+    </w:p>
+    <w:p>
+      <w:pPr>
+        <w:pStyle w:val="ListParagraph"/>
+        <w:numPr>
+          <w:ilvl w:val="1"/>
+          <w:numId w:val="1002"/>
+        </w:numPr>
+      </w:pPr>
+      <w:r>
+        <w:rPr>
+          <w:b/>
+          <w:i w:val="0"/>
+        </w:rPr>
+        <w:t xml:space="preserve">If the member identifies this as a forgotten recurring subscription or membership charge: </w:t>
+      </w:r>
+      <w:r>
+        <w:t>the transaction is authorized; advise the member accordingly and do not proceed with the trace.</w:t>
+      </w:r>
+    </w:p>
+    <w:p>
+      <w:pPr>
+        <w:pStyle w:val="ListParagraph"/>
+        <w:numPr>
+          <w:ilvl w:val="1"/>
+          <w:numId w:val="1002"/>
+        </w:numPr>
+      </w:pPr>
+      <w:r>
+        <w:rPr>
+          <w:b/>
+          <w:i w:val="0"/>
+        </w:rPr>
+        <w:t xml:space="preserve">If not: </w:t>
+      </w:r>
+      <w:r>
+        <w:t>proceed.</w:t>
       </w:r>
     </w:p>
     <w:p>
@@ -3534,12 +3610,12 @@
         <w:t>Confirm reason for the dispute</w:t>
       </w:r>
       <w:r>
-        <w:t xml:space="preserve"> — were the goods or services not received or not as described, or was the member charged twice or the wrong amount?</w:t>
-      </w:r>
-    </w:p>
-    <w:p>
-      <w:r>
-        <w:t>The Growth Team member should then fill out the existing POS/ATM trace form, record the member's narrative, create the case, add any required notices, and hand off the case to the Payment Services team. See the Current Process — How to Initiate an ATM &amp; POS Trace for the detailed trace form completion steps.</w:t>
+        <w:t xml:space="preserve"> — were the goods or services not received or not as described, or was the member charged twice or the wrong amount? Record the member's response for the CRM Service Request below.</w:t>
+      </w:r>
+    </w:p>
+    <w:p>
+      <w:r>
+        <w:t>The Growth team member should then create a CRM Service Request of ATM/POS Trace Request and complete the required fields with a note including the date/time of conversation with the member, method of instruction, and any other relevant details the member provided to help with the Payment Services team investigation.</w:t>
       </w:r>
     </w:p>
     <w:p>

</xml_diff>

<commit_message>
Clarify Dispute Narrative questions are guidance, not a required script
Added an explicit note that not every listed question needs to be asked
in every case, and that Step 1's second question (recurring/subscription
billing) is only needed if the first question's answer isn't already
clear -- these are guidance questions to inform judgment, not a mandatory
checklist.

Co-Authored-By: Claude Sonnet 5 <noreply@anthropic.com>
Claude-Session: https://claude.ai/code/session_01Msiz5p6hoKmmUHZyLJTkqb
</commit_message>
<xml_diff>
--- a/Dispute Resolution/DRAFT - Visa Debit Dispute Management Procedure.docx
+++ b/Dispute Resolution/DRAFT - Visa Debit Dispute Management Procedure.docx
@@ -3554,7 +3554,7 @@
         <w:t>Dispute Narrative</w:t>
       </w:r>
       <w:r>
-        <w:t xml:space="preserve"> — using the open-text Dispute Narrative field, record notes on what the member is disputing. Based on what the member shares, also determine whether the transaction is recognized or unrecognized, in order to route the case to the correct team. Ask the member the following questions, in order:</w:t>
+        <w:t xml:space="preserve"> — using the open-text Dispute Narrative field, record notes on what the member is disputing. Based on what the member shares, also determine whether the transaction is recognized or unrecognized, in order to route the case to the correct team. The questions below are guidance only — not every question needs to be asked in every case; use judgment based on what the member shares.</w:t>
       </w:r>
     </w:p>
     <w:p>
@@ -3572,7 +3572,7 @@
         <w:t xml:space="preserve">Step 1 — Determine recognition: </w:t>
       </w:r>
       <w:r>
-        <w:t>ask the member:</w:t>
+        <w:t>ask the member the guidance questions below as needed to determine recognition. If the first question already gives a clear answer, the second question may not be necessary:</w:t>
       </w:r>
     </w:p>
     <w:p>
@@ -3616,7 +3616,7 @@
         </w:numPr>
       </w:pPr>
       <w:r>
-        <w:t>Ask: “Could this charge be part of a recurring subscription or membership you may have forgotten about?”</w:t>
+        <w:t>If needed, ask: “Could this charge be part of a recurring subscription or membership you may have forgotten about?”</w:t>
       </w:r>
     </w:p>
     <w:p>

</xml_diff>

<commit_message>
Simplify Dispute Narrative; relocate reason/merchant-contact to Trace Request
- 4.2.3 Dispute Narrative: dropped the fraud-specific follow-up questions
  (card possession, PIN sharing) entirely, and removed the Step
  labeling now that only the recognition-determination questions remain.
- 4.2.5 ATM/POS Trace Request (Non-Fraud): added the dispute-reason and
  prior-merchant-contact questions here instead, since they're
  Non-Fraud-specific narrative detail rather than part of the universal
  recognition determination. Softened the merchant-contact guidance to a
  recommendation rather than a requirement, with a sample "not yet
  contacted" answer.
- Defined "method of instruction" as Branch or phone.

Co-Authored-By: Claude Sonnet 5 <noreply@anthropic.com>
Claude-Session: https://claude.ai/code/session_01Msiz5p6hoKmmUHZyLJTkqb
</commit_message>
<xml_diff>
--- a/Dispute Resolution/DRAFT - Visa Debit Dispute Management Procedure.docx
+++ b/Dispute Resolution/DRAFT - Visa Debit Dispute Management Procedure.docx
@@ -3554,7 +3554,7 @@
         <w:t>Dispute Narrative</w:t>
       </w:r>
       <w:r>
-        <w:t xml:space="preserve"> — using the open-text Dispute Narrative field, record notes on what the member is disputing. Based on what the member shares, also determine whether the transaction is recognized or unrecognized, in order to route the case to the correct team. The questions below are guidance only — not every question needs to be asked in every case; use judgment based on what the member shares.</w:t>
+        <w:t xml:space="preserve"> — using the open-text Dispute Narrative field, record notes on what the member is disputing, and determine whether the transaction is recognized or unrecognized in order to route the case to the correct team. See below guidance questions — not every question needs to be asked in every case; if the first question already gives a clear answer, the second question may not be necessary:</w:t>
       </w:r>
     </w:p>
     <w:p>
@@ -3565,80 +3565,7 @@
         </w:numPr>
       </w:pPr>
       <w:r>
-        <w:rPr>
-          <w:b/>
-          <w:i w:val="0"/>
-        </w:rPr>
-        <w:t xml:space="preserve">Step 1 — Determine recognition: </w:t>
-      </w:r>
-      <w:r>
-        <w:t>ask the member the guidance questions below as needed to determine recognition. If the first question already gives a clear answer, the second question may not be necessary:</w:t>
-      </w:r>
-    </w:p>
-    <w:p>
-      <w:pPr>
-        <w:numPr>
-          <w:ilvl w:val="2"/>
-          <w:numId w:val="24"/>
-        </w:numPr>
-      </w:pPr>
-      <w:r>
         <w:t>Ask: “Did you authorize this transaction? Do you recognize the merchant name, even if you don’t recall the specific purchase?”</w:t>
-      </w:r>
-    </w:p>
-    <w:p>
-      <w:pPr>
-        <w:numPr>
-          <w:ilvl w:val="2"/>
-          <w:numId w:val="24"/>
-        </w:numPr>
-      </w:pPr>
-      <w:r>
-        <w:t>Example answer: “No, I’ve never heard of this merchant.” — What it means: this indicates Fraud.</w:t>
-      </w:r>
-    </w:p>
-    <w:p>
-      <w:pPr>
-        <w:numPr>
-          <w:ilvl w:val="2"/>
-          <w:numId w:val="24"/>
-        </w:numPr>
-      </w:pPr>
-      <w:r>
-        <w:t>Example answer: “Yes, I recognize the merchant and I made that transaction.” — What it means: this indicates Non-Fraud.</w:t>
-      </w:r>
-    </w:p>
-    <w:p>
-      <w:pPr>
-        <w:numPr>
-          <w:ilvl w:val="2"/>
-          <w:numId w:val="24"/>
-        </w:numPr>
-      </w:pPr>
-      <w:r>
-        <w:t>If needed, ask: “Could this charge be part of a recurring subscription or membership you may have forgotten about?”</w:t>
-      </w:r>
-    </w:p>
-    <w:p>
-      <w:pPr>
-        <w:numPr>
-          <w:ilvl w:val="2"/>
-          <w:numId w:val="24"/>
-        </w:numPr>
-      </w:pPr>
-      <w:r>
-        <w:t>Example answer: “Oh, I think I signed up for a trial a few months ago.” — What it means: this indicates Non-Fraud (a forgotten subscription).</w:t>
-      </w:r>
-    </w:p>
-    <w:p>
-      <w:pPr>
-        <w:numPr>
-          <w:ilvl w:val="2"/>
-          <w:numId w:val="24"/>
-        </w:numPr>
-      </w:pPr>
-      <w:r>
-        <w:t>Example answer: “No, I don’t have any subscriptions with this merchant.” — What it means: this indicates Fraud (likely an unauthorized transaction).</w:t>
       </w:r>
     </w:p>
     <w:p>
@@ -3649,25 +3576,7 @@
         </w:numPr>
       </w:pPr>
       <w:r>
-        <w:rPr>
-          <w:b/>
-          <w:i w:val="0"/>
-        </w:rPr>
-        <w:t xml:space="preserve">Step 2 — Capture the reason for the dispute: </w:t>
-      </w:r>
-      <w:r>
-        <w:t>ask the member:</w:t>
-      </w:r>
-    </w:p>
-    <w:p>
-      <w:pPr>
-        <w:numPr>
-          <w:ilvl w:val="2"/>
-          <w:numId w:val="24"/>
-        </w:numPr>
-      </w:pPr>
-      <w:r>
-        <w:t>Ask: “Were the goods or services not received or not as described, or were you charged twice or the wrong amount?”</w:t>
+        <w:t>Example answer: “No, I’ve never heard of this merchant.” — What it means: this indicates Fraud.</w:t>
       </w:r>
     </w:p>
     <w:p>
@@ -3678,33 +3587,40 @@
         </w:numPr>
       </w:pPr>
       <w:r>
-        <w:rPr>
-          <w:b/>
-          <w:i w:val="0"/>
-        </w:rPr>
-        <w:t xml:space="preserve">Step 3 — Ask one additional context question, based on the Fraud/Non-Fraud determination from Step 1: </w:t>
+        <w:t>Example answer: “Yes, I recognize the merchant and I made that transaction.” — What it means: this indicates Non-Fraud.</w:t>
       </w:r>
     </w:p>
     <w:p>
       <w:pPr>
         <w:numPr>
-          <w:ilvl w:val="2"/>
+          <w:ilvl w:val="1"/>
           <w:numId w:val="24"/>
         </w:numPr>
       </w:pPr>
       <w:r>
-        <w:t>If Step 1 indicated Fraud, ask: “Is the card currently in your possession? Have you shared your PIN with anyone?”</w:t>
+        <w:t>If needed, ask: “Could this charge be part of a recurring subscription or membership you may have forgotten about?”</w:t>
       </w:r>
     </w:p>
     <w:p>
       <w:pPr>
         <w:numPr>
-          <w:ilvl w:val="2"/>
+          <w:ilvl w:val="1"/>
           <w:numId w:val="24"/>
         </w:numPr>
       </w:pPr>
       <w:r>
-        <w:t>If Step 1 indicated Non-Fraud, ask: “Have you contacted the merchant to try to resolve the issue? If so, what was their response?”</w:t>
+        <w:t>Example answer: “Oh, I think I signed up for a trial a few months ago.” — What it means: this indicates Non-Fraud (a forgotten subscription).</w:t>
+      </w:r>
+    </w:p>
+    <w:p>
+      <w:pPr>
+        <w:numPr>
+          <w:ilvl w:val="1"/>
+          <w:numId w:val="24"/>
+        </w:numPr>
+      </w:pPr>
+      <w:r>
+        <w:t>Example answer: “No, I don’t have any subscriptions with this merchant.” — What it means: this indicates Fraud (likely an unauthorized transaction).</w:t>
       </w:r>
     </w:p>
     <w:p>
@@ -3804,7 +3720,7 @@
         </w:numPr>
       </w:pPr>
       <w:r>
-        <w:t>Method of instruction</w:t>
+        <w:t>Method of instruction (e.g., Branch or phone)</w:t>
       </w:r>
     </w:p>
     <w:p>
@@ -3827,6 +3743,71 @@
       </w:pPr>
       <w:r>
         <w:t>Any other relevant details the member provided</w:t>
+      </w:r>
+    </w:p>
+    <w:p>
+      <w:pPr>
+        <w:numPr>
+          <w:ilvl w:val="0"/>
+          <w:numId w:val="24"/>
+        </w:numPr>
+      </w:pPr>
+      <w:r>
+        <w:rPr>
+          <w:b/>
+          <w:i w:val="0"/>
+        </w:rPr>
+        <w:t>Dispute narrative</w:t>
+      </w:r>
+      <w:r>
+        <w:t xml:space="preserve"> — see below guidance questions to ask the member:</w:t>
+      </w:r>
+    </w:p>
+    <w:p>
+      <w:pPr>
+        <w:numPr>
+          <w:ilvl w:val="1"/>
+          <w:numId w:val="24"/>
+        </w:numPr>
+      </w:pPr>
+      <w:r>
+        <w:rPr>
+          <w:b w:val="0"/>
+          <w:i/>
+        </w:rPr>
+        <w:t>Reason for the dispute</w:t>
+      </w:r>
+      <w:r>
+        <w:t xml:space="preserve"> — ask: “Were the goods or services not received or not as described, or were you charged twice or the wrong amount?”</w:t>
+      </w:r>
+    </w:p>
+    <w:p>
+      <w:pPr>
+        <w:numPr>
+          <w:ilvl w:val="1"/>
+          <w:numId w:val="24"/>
+        </w:numPr>
+      </w:pPr>
+      <w:r>
+        <w:rPr>
+          <w:b w:val="0"/>
+          <w:i/>
+        </w:rPr>
+        <w:t>Prior merchant contact</w:t>
+      </w:r>
+      <w:r>
+        <w:t xml:space="preserve"> — ask: “Have you contacted the merchant to try to resolve the issue? If so, what was their response?”</w:t>
+      </w:r>
+    </w:p>
+    <w:p>
+      <w:pPr>
+        <w:numPr>
+          <w:ilvl w:val="2"/>
+          <w:numId w:val="24"/>
+        </w:numPr>
+      </w:pPr>
+      <w:r>
+        <w:t>Example answer: “No, I haven’t reached out to them yet.” — Guidance: recommend that the member try contacting the merchant first, as it may resolve the issue faster — but this is a recommendation, not a requirement.</w:t>
       </w:r>
     </w:p>
     <w:p>

</xml_diff>

<commit_message>
Rename 4.2.3 narrative label to Determine Recognition of Transaction
Now that reason-for-dispute and prior-merchant-contact have moved to the
ATM/POS Trace Request section, this bullet only covers determining
recognition, so the label and intro sentence were updated to match
rather than still being framed as a general "Dispute Narrative" capture.

Co-Authored-By: Claude Sonnet 5 <noreply@anthropic.com>
Claude-Session: https://claude.ai/code/session_01Msiz5p6hoKmmUHZyLJTkqb
</commit_message>
<xml_diff>
--- a/Dispute Resolution/DRAFT - Visa Debit Dispute Management Procedure.docx
+++ b/Dispute Resolution/DRAFT - Visa Debit Dispute Management Procedure.docx
@@ -3551,10 +3551,10 @@
           <w:b/>
           <w:i w:val="0"/>
         </w:rPr>
-        <w:t>Dispute Narrative</w:t>
-      </w:r>
-      <w:r>
-        <w:t xml:space="preserve"> — using the open-text Dispute Narrative field, record notes on what the member is disputing, and determine whether the transaction is recognized or unrecognized in order to route the case to the correct team. See below guidance questions — not every question needs to be asked in every case; if the first question already gives a clear answer, the second question may not be necessary:</w:t>
+        <w:t>Determine Recognition of Transaction</w:t>
+      </w:r>
+      <w:r>
+        <w:t xml:space="preserve"> — using the open-text Dispute Narrative field, determine whether the transaction is recognized or unrecognized, in order to route the case to the correct team. The questions below are guidance only — not every question needs to be asked in every case; use judgment based on what the member shares:</w:t>
       </w:r>
     </w:p>
     <w:p>

</xml_diff>